<commit_message>
docs(identity): publish the hosted Render URL
The Identity Service now runs at
https://university-identity-service.onrender.com with PostgreSQL and
persistent signing keys.

- README, API contract and handover document list the hosted base URL,
  Swagger and JWKS, and explain the free plan's sleep behaviour.
- In the handover document, "shared environment URL" moves from pending
  decisions to the change log, and the limitations describe the hosted
  setup (free plan, 30-day database) instead of SQLite.
</commit_message>
<xml_diff>
--- a/docs/Identity_Service_Integration_Handover.docx
+++ b/docs/Identity_Service_Integration_Handover.docx
@@ -825,85 +825,52 @@
             </w:pPr>
             <w:r>
               <w:rPr>
-                <w:sz w:val="19"/>
-                <w:szCs w:val="19"/>
-              </w:rPr>
-              <w:t xml:space="preserve">Internal base URL</w:t>
-            </w:r>
-          </w:p>
-        </w:tc>
-        <w:tc>
-          <w:tcPr>
-            <w:tcW w:type="dxa" w:w="6747"/>
-            <w:tcBorders>
-              <w:top w:val="single" w:color="BFBFBF" w:sz="4"/>
-              <w:left w:val="single" w:color="BFBFBF" w:sz="4"/>
-              <w:bottom w:val="single" w:color="BFBFBF" w:sz="4"/>
-              <w:right w:val="single" w:color="BFBFBF" w:sz="4"/>
-            </w:tcBorders>
-            <w:tcMar>
-              <w:top w:type="dxa" w:w="50"/>
-              <w:left w:type="dxa" w:w="90"/>
-              <w:bottom w:type="dxa" w:w="50"/>
-              <w:right w:type="dxa" w:w="90"/>
-            </w:tcMar>
-          </w:tcPr>
-          <w:p>
-            <w:pPr>
-              <w:spacing w:after="0"/>
-            </w:pPr>
-            <w:r>
-              <w:rPr>
                 <w:b/>
                 <w:bCs/>
                 <w:sz w:val="19"/>
                 <w:szCs w:val="19"/>
               </w:rPr>
-              <w:t xml:space="preserve">Configurable.</w:t>
-            </w:r>
-            <w:r>
-              <w:rPr>
-                <w:sz w:val="19"/>
-                <w:szCs w:val="19"/>
-              </w:rPr>
-              <w:t xml:space="preserve"> Local default </w:t>
-            </w:r>
+              <w:t xml:space="preserve">Hosted (Render)</w:t>
+            </w:r>
+          </w:p>
+        </w:tc>
+        <w:tc>
+          <w:tcPr>
+            <w:tcW w:type="dxa" w:w="6747"/>
+            <w:tcBorders>
+              <w:top w:val="single" w:color="BFBFBF" w:sz="4"/>
+              <w:left w:val="single" w:color="BFBFBF" w:sz="4"/>
+              <w:bottom w:val="single" w:color="BFBFBF" w:sz="4"/>
+              <w:right w:val="single" w:color="BFBFBF" w:sz="4"/>
+            </w:tcBorders>
+            <w:tcMar>
+              <w:top w:type="dxa" w:w="50"/>
+              <w:left w:type="dxa" w:w="90"/>
+              <w:bottom w:type="dxa" w:w="50"/>
+              <w:right w:type="dxa" w:w="90"/>
+            </w:tcMar>
+          </w:tcPr>
+          <w:p>
+            <w:pPr>
+              <w:spacing w:after="0"/>
+            </w:pPr>
             <w:r>
               <w:rPr>
                 <w:rFonts w:ascii="Consolas" w:cs="Consolas" w:eastAsia="Consolas" w:hAnsi="Consolas"/>
+                <w:b/>
+                <w:bCs/>
                 <w:color w:val="7A2E0E"/>
                 <w:sz w:val="19"/>
                 <w:szCs w:val="19"/>
               </w:rPr>
-              <w:t xml:space="preserve">http://localhost:8001</w:t>
-            </w:r>
-            <w:r>
-              <w:rPr>
-                <w:sz w:val="19"/>
-                <w:szCs w:val="19"/>
-              </w:rPr>
-              <w:t xml:space="preserve">.</w:t>
-            </w:r>
-          </w:p>
-          <w:p>
-            <w:pPr>
-              <w:spacing w:after="0"/>
-            </w:pPr>
-            <w:r>
-              <w:rPr>
-                <w:sz w:val="19"/>
-                <w:szCs w:val="19"/>
-              </w:rPr>
-              <w:t xml:space="preserve">In Docker Compose use the service name, e.g. </w:t>
-            </w:r>
-            <w:r>
-              <w:rPr>
-                <w:rFonts w:ascii="Consolas" w:cs="Consolas" w:eastAsia="Consolas" w:hAnsi="Consolas"/>
-                <w:color w:val="7A2E0E"/>
-                <w:sz w:val="19"/>
-                <w:szCs w:val="19"/>
-              </w:rPr>
-              <w:t xml:space="preserve">http://identity-service:8001</w:t>
+              <w:t xml:space="preserve">https://university-identity-service.onrender.com</w:t>
+            </w:r>
+            <w:r>
+              <w:rPr>
+                <w:sz w:val="19"/>
+                <w:szCs w:val="19"/>
+              </w:rPr>
+              <w:t xml:space="preserve">. Use this for integration testing</w:t>
             </w:r>
           </w:p>
         </w:tc>
@@ -937,7 +904,7 @@
                 <w:sz w:val="19"/>
                 <w:szCs w:val="19"/>
               </w:rPr>
-              <w:t xml:space="preserve">API prefix</w:t>
+              <w:t xml:space="preserve">Hosted Swagger / JWKS</w:t>
             </w:r>
           </w:p>
         </w:tc>
@@ -968,7 +935,21 @@
                 <w:sz w:val="19"/>
                 <w:szCs w:val="19"/>
               </w:rPr>
-              <w:t xml:space="preserve">/api/v1</w:t>
+              <w:t xml:space="preserve">https://university-identity-service.onrender.com/docs</w:t>
+            </w:r>
+          </w:p>
+          <w:p>
+            <w:pPr>
+              <w:spacing w:after="0"/>
+            </w:pPr>
+            <w:r>
+              <w:rPr>
+                <w:rFonts w:ascii="Consolas" w:cs="Consolas" w:eastAsia="Consolas" w:hAnsi="Consolas"/>
+                <w:color w:val="7A2E0E"/>
+                <w:sz w:val="19"/>
+                <w:szCs w:val="19"/>
+              </w:rPr>
+              <w:t xml:space="preserve">https://university-identity-service.onrender.com/.well-known/jwks.json</w:t>
             </w:r>
           </w:p>
         </w:tc>
@@ -1002,7 +983,7 @@
                 <w:sz w:val="19"/>
                 <w:szCs w:val="19"/>
               </w:rPr>
-              <w:t xml:space="preserve">Health check</w:t>
+              <w:t xml:space="preserve">Internal base URL</w:t>
             </w:r>
           </w:p>
         </w:tc>
@@ -1026,6 +1007,22 @@
             <w:pPr>
               <w:spacing w:after="0"/>
             </w:pPr>
+            <w:r>
+              <w:rPr>
+                <w:b/>
+                <w:bCs/>
+                <w:sz w:val="19"/>
+                <w:szCs w:val="19"/>
+              </w:rPr>
+              <w:t xml:space="preserve">Configurable.</w:t>
+            </w:r>
+            <w:r>
+              <w:rPr>
+                <w:sz w:val="19"/>
+                <w:szCs w:val="19"/>
+              </w:rPr>
+              <w:t xml:space="preserve"> Local default </w:t>
+            </w:r>
             <w:r>
               <w:rPr>
                 <w:rFonts w:ascii="Consolas" w:cs="Consolas" w:eastAsia="Consolas" w:hAnsi="Consolas"/>
@@ -1033,14 +1030,35 @@
                 <w:sz w:val="19"/>
                 <w:szCs w:val="19"/>
               </w:rPr>
-              <w:t xml:space="preserve">GET {base}/health</w:t>
-            </w:r>
-            <w:r>
-              <w:rPr>
-                <w:sz w:val="19"/>
-                <w:szCs w:val="19"/>
-              </w:rPr>
-              <w:t xml:space="preserve"> (no auth)</w:t>
+              <w:t xml:space="preserve">http://localhost:8001</w:t>
+            </w:r>
+            <w:r>
+              <w:rPr>
+                <w:sz w:val="19"/>
+                <w:szCs w:val="19"/>
+              </w:rPr>
+              <w:t xml:space="preserve">.</w:t>
+            </w:r>
+          </w:p>
+          <w:p>
+            <w:pPr>
+              <w:spacing w:after="0"/>
+            </w:pPr>
+            <w:r>
+              <w:rPr>
+                <w:sz w:val="19"/>
+                <w:szCs w:val="19"/>
+              </w:rPr>
+              <w:t xml:space="preserve">In Docker Compose use the service name, e.g. </w:t>
+            </w:r>
+            <w:r>
+              <w:rPr>
+                <w:rFonts w:ascii="Consolas" w:cs="Consolas" w:eastAsia="Consolas" w:hAnsi="Consolas"/>
+                <w:color w:val="7A2E0E"/>
+                <w:sz w:val="19"/>
+                <w:szCs w:val="19"/>
+              </w:rPr>
+              <w:t xml:space="preserve">http://identity-service:8001</w:t>
             </w:r>
           </w:p>
         </w:tc>
@@ -1074,7 +1092,7 @@
                 <w:sz w:val="19"/>
                 <w:szCs w:val="19"/>
               </w:rPr>
-              <w:t xml:space="preserve">JWT signing keys (JWKS)</w:t>
+              <w:t xml:space="preserve">API prefix</w:t>
             </w:r>
           </w:p>
         </w:tc>
@@ -1105,14 +1123,7 @@
                 <w:sz w:val="19"/>
                 <w:szCs w:val="19"/>
               </w:rPr>
-              <w:t xml:space="preserve">GET {base}/.well-known/jwks.json</w:t>
-            </w:r>
-            <w:r>
-              <w:rPr>
-                <w:sz w:val="19"/>
-                <w:szCs w:val="19"/>
-              </w:rPr>
-              <w:t xml:space="preserve"> (no auth)</w:t>
+              <w:t xml:space="preserve">/api/v1</w:t>
             </w:r>
           </w:p>
         </w:tc>
@@ -1146,7 +1157,7 @@
                 <w:sz w:val="19"/>
                 <w:szCs w:val="19"/>
               </w:rPr>
-              <w:t xml:space="preserve">Swagger / OpenAPI</w:t>
+              <w:t xml:space="preserve">Health check</w:t>
             </w:r>
           </w:p>
         </w:tc>
@@ -1177,39 +1188,14 @@
                 <w:sz w:val="19"/>
                 <w:szCs w:val="19"/>
               </w:rPr>
-              <w:t xml:space="preserve">{base}/docs</w:t>
-            </w:r>
-            <w:r>
-              <w:rPr>
-                <w:sz w:val="19"/>
-                <w:szCs w:val="19"/>
-              </w:rPr>
-              <w:t xml:space="preserve"> · </w:t>
-            </w:r>
-            <w:r>
-              <w:rPr>
-                <w:rFonts w:ascii="Consolas" w:cs="Consolas" w:eastAsia="Consolas" w:hAnsi="Consolas"/>
-                <w:color w:val="7A2E0E"/>
-                <w:sz w:val="19"/>
-                <w:szCs w:val="19"/>
-              </w:rPr>
-              <w:t xml:space="preserve">{base}/redoc</w:t>
-            </w:r>
-            <w:r>
-              <w:rPr>
-                <w:sz w:val="19"/>
-                <w:szCs w:val="19"/>
-              </w:rPr>
-              <w:t xml:space="preserve"> · </w:t>
-            </w:r>
-            <w:r>
-              <w:rPr>
-                <w:rFonts w:ascii="Consolas" w:cs="Consolas" w:eastAsia="Consolas" w:hAnsi="Consolas"/>
-                <w:color w:val="7A2E0E"/>
-                <w:sz w:val="19"/>
-                <w:szCs w:val="19"/>
-              </w:rPr>
-              <w:t xml:space="preserve">{base}/openapi.json</w:t>
+              <w:t xml:space="preserve">GET {base}/health</w:t>
+            </w:r>
+            <w:r>
+              <w:rPr>
+                <w:sz w:val="19"/>
+                <w:szCs w:val="19"/>
+              </w:rPr>
+              <w:t xml:space="preserve"> (no auth)</w:t>
             </w:r>
           </w:p>
         </w:tc>
@@ -1243,7 +1229,7 @@
                 <w:sz w:val="19"/>
                 <w:szCs w:val="19"/>
               </w:rPr>
-              <w:t xml:space="preserve">Directory Service (related)</w:t>
+              <w:t xml:space="preserve">JWT signing keys (JWKS)</w:t>
             </w:r>
           </w:p>
         </w:tc>
@@ -1267,13 +1253,6 @@
             <w:pPr>
               <w:spacing w:after="0"/>
             </w:pPr>
-            <w:r>
-              <w:rPr>
-                <w:sz w:val="19"/>
-                <w:szCs w:val="19"/>
-              </w:rPr>
-              <w:t xml:space="preserve">Configurable; Sprint 1 default </w:t>
-            </w:r>
             <w:r>
               <w:rPr>
                 <w:rFonts w:ascii="Consolas" w:cs="Consolas" w:eastAsia="Consolas" w:hAnsi="Consolas"/>
@@ -1281,7 +1260,14 @@
                 <w:sz w:val="19"/>
                 <w:szCs w:val="19"/>
               </w:rPr>
-              <w:t xml:space="preserve">http://localhost:8002</w:t>
+              <w:t xml:space="preserve">GET {base}/.well-known/jwks.json</w:t>
+            </w:r>
+            <w:r>
+              <w:rPr>
+                <w:sz w:val="19"/>
+                <w:szCs w:val="19"/>
+              </w:rPr>
+              <w:t xml:space="preserve"> (no auth)</w:t>
             </w:r>
           </w:p>
         </w:tc>
@@ -1315,6 +1301,175 @@
                 <w:sz w:val="19"/>
                 <w:szCs w:val="19"/>
               </w:rPr>
+              <w:t xml:space="preserve">Swagger / OpenAPI</w:t>
+            </w:r>
+          </w:p>
+        </w:tc>
+        <w:tc>
+          <w:tcPr>
+            <w:tcW w:type="dxa" w:w="6747"/>
+            <w:tcBorders>
+              <w:top w:val="single" w:color="BFBFBF" w:sz="4"/>
+              <w:left w:val="single" w:color="BFBFBF" w:sz="4"/>
+              <w:bottom w:val="single" w:color="BFBFBF" w:sz="4"/>
+              <w:right w:val="single" w:color="BFBFBF" w:sz="4"/>
+            </w:tcBorders>
+            <w:tcMar>
+              <w:top w:type="dxa" w:w="50"/>
+              <w:left w:type="dxa" w:w="90"/>
+              <w:bottom w:type="dxa" w:w="50"/>
+              <w:right w:type="dxa" w:w="90"/>
+            </w:tcMar>
+          </w:tcPr>
+          <w:p>
+            <w:pPr>
+              <w:spacing w:after="0"/>
+            </w:pPr>
+            <w:r>
+              <w:rPr>
+                <w:rFonts w:ascii="Consolas" w:cs="Consolas" w:eastAsia="Consolas" w:hAnsi="Consolas"/>
+                <w:color w:val="7A2E0E"/>
+                <w:sz w:val="19"/>
+                <w:szCs w:val="19"/>
+              </w:rPr>
+              <w:t xml:space="preserve">{base}/docs</w:t>
+            </w:r>
+            <w:r>
+              <w:rPr>
+                <w:sz w:val="19"/>
+                <w:szCs w:val="19"/>
+              </w:rPr>
+              <w:t xml:space="preserve"> · </w:t>
+            </w:r>
+            <w:r>
+              <w:rPr>
+                <w:rFonts w:ascii="Consolas" w:cs="Consolas" w:eastAsia="Consolas" w:hAnsi="Consolas"/>
+                <w:color w:val="7A2E0E"/>
+                <w:sz w:val="19"/>
+                <w:szCs w:val="19"/>
+              </w:rPr>
+              <w:t xml:space="preserve">{base}/redoc</w:t>
+            </w:r>
+            <w:r>
+              <w:rPr>
+                <w:sz w:val="19"/>
+                <w:szCs w:val="19"/>
+              </w:rPr>
+              <w:t xml:space="preserve"> · </w:t>
+            </w:r>
+            <w:r>
+              <w:rPr>
+                <w:rFonts w:ascii="Consolas" w:cs="Consolas" w:eastAsia="Consolas" w:hAnsi="Consolas"/>
+                <w:color w:val="7A2E0E"/>
+                <w:sz w:val="19"/>
+                <w:szCs w:val="19"/>
+              </w:rPr>
+              <w:t xml:space="preserve">{base}/openapi.json</w:t>
+            </w:r>
+          </w:p>
+        </w:tc>
+      </w:tr>
+      <w:tr>
+        <w:trPr>
+          <w:cantSplit/>
+        </w:trPr>
+        <w:tc>
+          <w:tcPr>
+            <w:tcW w:type="dxa" w:w="2891"/>
+            <w:tcBorders>
+              <w:top w:val="single" w:color="BFBFBF" w:sz="4"/>
+              <w:left w:val="single" w:color="BFBFBF" w:sz="4"/>
+              <w:bottom w:val="single" w:color="BFBFBF" w:sz="4"/>
+              <w:right w:val="single" w:color="BFBFBF" w:sz="4"/>
+            </w:tcBorders>
+            <w:tcMar>
+              <w:top w:type="dxa" w:w="50"/>
+              <w:left w:type="dxa" w:w="90"/>
+              <w:bottom w:type="dxa" w:w="50"/>
+              <w:right w:type="dxa" w:w="90"/>
+            </w:tcMar>
+          </w:tcPr>
+          <w:p>
+            <w:pPr>
+              <w:spacing w:after="0"/>
+            </w:pPr>
+            <w:r>
+              <w:rPr>
+                <w:sz w:val="19"/>
+                <w:szCs w:val="19"/>
+              </w:rPr>
+              <w:t xml:space="preserve">Directory Service (related)</w:t>
+            </w:r>
+          </w:p>
+        </w:tc>
+        <w:tc>
+          <w:tcPr>
+            <w:tcW w:type="dxa" w:w="6747"/>
+            <w:tcBorders>
+              <w:top w:val="single" w:color="BFBFBF" w:sz="4"/>
+              <w:left w:val="single" w:color="BFBFBF" w:sz="4"/>
+              <w:bottom w:val="single" w:color="BFBFBF" w:sz="4"/>
+              <w:right w:val="single" w:color="BFBFBF" w:sz="4"/>
+            </w:tcBorders>
+            <w:tcMar>
+              <w:top w:type="dxa" w:w="50"/>
+              <w:left w:type="dxa" w:w="90"/>
+              <w:bottom w:type="dxa" w:w="50"/>
+              <w:right w:type="dxa" w:w="90"/>
+            </w:tcMar>
+          </w:tcPr>
+          <w:p>
+            <w:pPr>
+              <w:spacing w:after="0"/>
+            </w:pPr>
+            <w:r>
+              <w:rPr>
+                <w:sz w:val="19"/>
+                <w:szCs w:val="19"/>
+              </w:rPr>
+              <w:t xml:space="preserve">Configurable; Sprint 1 default </w:t>
+            </w:r>
+            <w:r>
+              <w:rPr>
+                <w:rFonts w:ascii="Consolas" w:cs="Consolas" w:eastAsia="Consolas" w:hAnsi="Consolas"/>
+                <w:color w:val="7A2E0E"/>
+                <w:sz w:val="19"/>
+                <w:szCs w:val="19"/>
+              </w:rPr>
+              <w:t xml:space="preserve">http://localhost:8002</w:t>
+            </w:r>
+          </w:p>
+        </w:tc>
+      </w:tr>
+      <w:tr>
+        <w:trPr>
+          <w:cantSplit/>
+        </w:trPr>
+        <w:tc>
+          <w:tcPr>
+            <w:tcW w:type="dxa" w:w="2891"/>
+            <w:tcBorders>
+              <w:top w:val="single" w:color="BFBFBF" w:sz="4"/>
+              <w:left w:val="single" w:color="BFBFBF" w:sz="4"/>
+              <w:bottom w:val="single" w:color="BFBFBF" w:sz="4"/>
+              <w:right w:val="single" w:color="BFBFBF" w:sz="4"/>
+            </w:tcBorders>
+            <w:tcMar>
+              <w:top w:type="dxa" w:w="50"/>
+              <w:left w:type="dxa" w:w="90"/>
+              <w:bottom w:type="dxa" w:w="50"/>
+              <w:right w:type="dxa" w:w="90"/>
+            </w:tcMar>
+          </w:tcPr>
+          <w:p>
+            <w:pPr>
+              <w:spacing w:after="0"/>
+            </w:pPr>
+            <w:r>
+              <w:rPr>
+                <w:sz w:val="19"/>
+                <w:szCs w:val="19"/>
+              </w:rPr>
               <w:t xml:space="preserve">API Gateway base path</w:t>
             </w:r>
           </w:p>
@@ -1445,6 +1600,26 @@
       </w:r>
       <w:r>
         <w:t xml:space="preserve">.</w:t>
+      </w:r>
+    </w:p>
+    <w:p>
+      <w:pPr>
+        <w:pBdr>
+          <w:left w:val="single" w:color="E69500" w:sz="18" w:space="6"/>
+        </w:pBdr>
+        <w:shd w:fill="FFF4E5" w:color="auto" w:val="clear"/>
+        <w:spacing w:after="160" w:before="60"/>
+        <w:ind w:left="120"/>
+      </w:pPr>
+      <w:r>
+        <w:rPr>
+          <w:b/>
+          <w:bCs/>
+        </w:rPr>
+        <w:t xml:space="preserve">The hosted instance sleeps after 15 minutes without traffic</w:t>
+      </w:r>
+      <w:r>
+        <w:t xml:space="preserve"> (Render free plan). The first request after that takes about a minute, so use generous timeouts (60–90 s) when calling it from another service. Tokens and data survive restarts: it runs on PostgreSQL with fixed signing keys.</w:t>
       </w:r>
     </w:p>
     <w:p>
@@ -7017,7 +7192,19 @@
         <w:t xml:space="preserve">$BASE</w:t>
       </w:r>
       <w:r>
-        <w:t xml:space="preserve"> with the Identity base URL (e.g. </w:t>
+        <w:t xml:space="preserve"> with the Identity base URL (hosted: </w:t>
+      </w:r>
+      <w:r>
+        <w:rPr>
+          <w:rFonts w:ascii="Consolas" w:cs="Consolas" w:eastAsia="Consolas" w:hAnsi="Consolas"/>
+          <w:color w:val="7A2E0E"/>
+          <w:sz w:val="19"/>
+          <w:szCs w:val="19"/>
+        </w:rPr>
+        <w:t xml:space="preserve">https://university-identity-service.onrender.com</w:t>
+      </w:r>
+      <w:r>
+        <w:t xml:space="preserve">; local: </w:t>
       </w:r>
       <w:r>
         <w:rPr>
@@ -20641,6 +20828,45 @@
     </w:p>
     <w:p>
       <w:pPr>
+        <w:spacing w:after="120"/>
+      </w:pPr>
+      <w:r>
+        <w:rPr>
+          <w:b/>
+          <w:bCs/>
+        </w:rPr>
+        <w:t xml:space="preserve">Try them now</w:t>
+      </w:r>
+      <w:r>
+        <w:t xml:space="preserve"> on the hosted service: </w:t>
+      </w:r>
+      <w:r>
+        <w:rPr>
+          <w:rFonts w:ascii="Consolas" w:cs="Consolas" w:eastAsia="Consolas" w:hAnsi="Consolas"/>
+          <w:color w:val="7A2E0E"/>
+          <w:sz w:val="19"/>
+          <w:szCs w:val="19"/>
+        </w:rPr>
+        <w:t xml:space="preserve">https://university-identity-service.onrender.com/docs</w:t>
+      </w:r>
+      <w:r>
+        <w:t xml:space="preserve"> → </w:t>
+      </w:r>
+      <w:r>
+        <w:rPr>
+          <w:rFonts w:ascii="Consolas" w:cs="Consolas" w:eastAsia="Consolas" w:hAnsi="Consolas"/>
+          <w:color w:val="7A2E0E"/>
+          <w:sz w:val="19"/>
+          <w:szCs w:val="19"/>
+        </w:rPr>
+        <w:t xml:space="preserve">POST /api/v1/auth/login</w:t>
+      </w:r>
+      <w:r>
+        <w:t xml:space="preserve">.</w:t>
+      </w:r>
+    </w:p>
+    <w:p>
+      <w:pPr>
         <w:pStyle w:val="Heading2"/>
       </w:pPr>
       <w:r>
@@ -20867,7 +21093,7 @@
                 <w:sz w:val="19"/>
                 <w:szCs w:val="19"/>
               </w:rPr>
-              <w:t xml:space="preserve">URL (local default)</w:t>
+              <w:t xml:space="preserve">URL</w:t>
             </w:r>
           </w:p>
         </w:tc>
@@ -20901,7 +21127,7 @@
                 <w:sz w:val="19"/>
                 <w:szCs w:val="19"/>
               </w:rPr>
-              <w:t xml:space="preserve">Swagger UI (try requests in the browser)</w:t>
+              <w:t xml:space="preserve">Swagger UI (hosted)</w:t>
             </w:r>
           </w:p>
         </w:tc>
@@ -20932,7 +21158,7 @@
                 <w:sz w:val="19"/>
                 <w:szCs w:val="19"/>
               </w:rPr>
-              <w:t xml:space="preserve">http://localhost:8001/docs</w:t>
+              <w:t xml:space="preserve">https://university-identity-service.onrender.com/docs</w:t>
             </w:r>
           </w:p>
         </w:tc>
@@ -20966,7 +21192,7 @@
                 <w:sz w:val="19"/>
                 <w:szCs w:val="19"/>
               </w:rPr>
-              <w:t xml:space="preserve">ReDoc (read-only reference)</w:t>
+              <w:t xml:space="preserve">OpenAPI JSON (hosted)</w:t>
             </w:r>
           </w:p>
         </w:tc>
@@ -20997,7 +21223,7 @@
                 <w:sz w:val="19"/>
                 <w:szCs w:val="19"/>
               </w:rPr>
-              <w:t xml:space="preserve">http://localhost:8001/redoc</w:t>
+              <w:t xml:space="preserve">https://university-identity-service.onrender.com/openapi.json</w:t>
             </w:r>
           </w:p>
         </w:tc>
@@ -21031,7 +21257,7 @@
                 <w:sz w:val="19"/>
                 <w:szCs w:val="19"/>
               </w:rPr>
-              <w:t xml:space="preserve">OpenAPI JSON (for code generation)</w:t>
+              <w:t xml:space="preserve">JWKS (hosted)</w:t>
             </w:r>
           </w:p>
         </w:tc>
@@ -21062,7 +21288,7 @@
                 <w:sz w:val="19"/>
                 <w:szCs w:val="19"/>
               </w:rPr>
-              <w:t xml:space="preserve">http://localhost:8001/openapi.json</w:t>
+              <w:t xml:space="preserve">https://university-identity-service.onrender.com/.well-known/jwks.json</w:t>
             </w:r>
           </w:p>
         </w:tc>
@@ -21096,7 +21322,7 @@
                 <w:sz w:val="19"/>
                 <w:szCs w:val="19"/>
               </w:rPr>
-              <w:t xml:space="preserve">Health</w:t>
+              <w:t xml:space="preserve">Swagger UI (try requests in the browser) (local)</w:t>
             </w:r>
           </w:p>
         </w:tc>
@@ -21127,7 +21353,7 @@
                 <w:sz w:val="19"/>
                 <w:szCs w:val="19"/>
               </w:rPr>
-              <w:t xml:space="preserve">http://localhost:8001/health</w:t>
+              <w:t xml:space="preserve">http://localhost:8001/docs</w:t>
             </w:r>
           </w:p>
         </w:tc>
@@ -21161,7 +21387,202 @@
                 <w:sz w:val="19"/>
                 <w:szCs w:val="19"/>
               </w:rPr>
-              <w:t xml:space="preserve">JWKS</w:t>
+              <w:t xml:space="preserve">ReDoc (read-only reference) (local)</w:t>
+            </w:r>
+          </w:p>
+        </w:tc>
+        <w:tc>
+          <w:tcPr>
+            <w:tcW w:type="dxa" w:w="5301"/>
+            <w:tcBorders>
+              <w:top w:val="single" w:color="BFBFBF" w:sz="4"/>
+              <w:left w:val="single" w:color="BFBFBF" w:sz="4"/>
+              <w:bottom w:val="single" w:color="BFBFBF" w:sz="4"/>
+              <w:right w:val="single" w:color="BFBFBF" w:sz="4"/>
+            </w:tcBorders>
+            <w:tcMar>
+              <w:top w:type="dxa" w:w="50"/>
+              <w:left w:type="dxa" w:w="90"/>
+              <w:bottom w:type="dxa" w:w="50"/>
+              <w:right w:type="dxa" w:w="90"/>
+            </w:tcMar>
+          </w:tcPr>
+          <w:p>
+            <w:pPr>
+              <w:spacing w:after="0"/>
+            </w:pPr>
+            <w:r>
+              <w:rPr>
+                <w:rFonts w:ascii="Consolas" w:cs="Consolas" w:eastAsia="Consolas" w:hAnsi="Consolas"/>
+                <w:color w:val="7A2E0E"/>
+                <w:sz w:val="19"/>
+                <w:szCs w:val="19"/>
+              </w:rPr>
+              <w:t xml:space="preserve">http://localhost:8001/redoc</w:t>
+            </w:r>
+          </w:p>
+        </w:tc>
+      </w:tr>
+      <w:tr>
+        <w:trPr>
+          <w:cantSplit/>
+        </w:trPr>
+        <w:tc>
+          <w:tcPr>
+            <w:tcW w:type="dxa" w:w="4337"/>
+            <w:tcBorders>
+              <w:top w:val="single" w:color="BFBFBF" w:sz="4"/>
+              <w:left w:val="single" w:color="BFBFBF" w:sz="4"/>
+              <w:bottom w:val="single" w:color="BFBFBF" w:sz="4"/>
+              <w:right w:val="single" w:color="BFBFBF" w:sz="4"/>
+            </w:tcBorders>
+            <w:tcMar>
+              <w:top w:type="dxa" w:w="50"/>
+              <w:left w:type="dxa" w:w="90"/>
+              <w:bottom w:type="dxa" w:w="50"/>
+              <w:right w:type="dxa" w:w="90"/>
+            </w:tcMar>
+          </w:tcPr>
+          <w:p>
+            <w:pPr>
+              <w:spacing w:after="0"/>
+            </w:pPr>
+            <w:r>
+              <w:rPr>
+                <w:sz w:val="19"/>
+                <w:szCs w:val="19"/>
+              </w:rPr>
+              <w:t xml:space="preserve">OpenAPI JSON (for code generation) (local)</w:t>
+            </w:r>
+          </w:p>
+        </w:tc>
+        <w:tc>
+          <w:tcPr>
+            <w:tcW w:type="dxa" w:w="5301"/>
+            <w:tcBorders>
+              <w:top w:val="single" w:color="BFBFBF" w:sz="4"/>
+              <w:left w:val="single" w:color="BFBFBF" w:sz="4"/>
+              <w:bottom w:val="single" w:color="BFBFBF" w:sz="4"/>
+              <w:right w:val="single" w:color="BFBFBF" w:sz="4"/>
+            </w:tcBorders>
+            <w:tcMar>
+              <w:top w:type="dxa" w:w="50"/>
+              <w:left w:type="dxa" w:w="90"/>
+              <w:bottom w:type="dxa" w:w="50"/>
+              <w:right w:type="dxa" w:w="90"/>
+            </w:tcMar>
+          </w:tcPr>
+          <w:p>
+            <w:pPr>
+              <w:spacing w:after="0"/>
+            </w:pPr>
+            <w:r>
+              <w:rPr>
+                <w:rFonts w:ascii="Consolas" w:cs="Consolas" w:eastAsia="Consolas" w:hAnsi="Consolas"/>
+                <w:color w:val="7A2E0E"/>
+                <w:sz w:val="19"/>
+                <w:szCs w:val="19"/>
+              </w:rPr>
+              <w:t xml:space="preserve">http://localhost:8001/openapi.json</w:t>
+            </w:r>
+          </w:p>
+        </w:tc>
+      </w:tr>
+      <w:tr>
+        <w:trPr>
+          <w:cantSplit/>
+        </w:trPr>
+        <w:tc>
+          <w:tcPr>
+            <w:tcW w:type="dxa" w:w="4337"/>
+            <w:tcBorders>
+              <w:top w:val="single" w:color="BFBFBF" w:sz="4"/>
+              <w:left w:val="single" w:color="BFBFBF" w:sz="4"/>
+              <w:bottom w:val="single" w:color="BFBFBF" w:sz="4"/>
+              <w:right w:val="single" w:color="BFBFBF" w:sz="4"/>
+            </w:tcBorders>
+            <w:tcMar>
+              <w:top w:type="dxa" w:w="50"/>
+              <w:left w:type="dxa" w:w="90"/>
+              <w:bottom w:type="dxa" w:w="50"/>
+              <w:right w:type="dxa" w:w="90"/>
+            </w:tcMar>
+          </w:tcPr>
+          <w:p>
+            <w:pPr>
+              <w:spacing w:after="0"/>
+            </w:pPr>
+            <w:r>
+              <w:rPr>
+                <w:sz w:val="19"/>
+                <w:szCs w:val="19"/>
+              </w:rPr>
+              <w:t xml:space="preserve">Health (local)</w:t>
+            </w:r>
+          </w:p>
+        </w:tc>
+        <w:tc>
+          <w:tcPr>
+            <w:tcW w:type="dxa" w:w="5301"/>
+            <w:tcBorders>
+              <w:top w:val="single" w:color="BFBFBF" w:sz="4"/>
+              <w:left w:val="single" w:color="BFBFBF" w:sz="4"/>
+              <w:bottom w:val="single" w:color="BFBFBF" w:sz="4"/>
+              <w:right w:val="single" w:color="BFBFBF" w:sz="4"/>
+            </w:tcBorders>
+            <w:tcMar>
+              <w:top w:type="dxa" w:w="50"/>
+              <w:left w:type="dxa" w:w="90"/>
+              <w:bottom w:type="dxa" w:w="50"/>
+              <w:right w:type="dxa" w:w="90"/>
+            </w:tcMar>
+          </w:tcPr>
+          <w:p>
+            <w:pPr>
+              <w:spacing w:after="0"/>
+            </w:pPr>
+            <w:r>
+              <w:rPr>
+                <w:rFonts w:ascii="Consolas" w:cs="Consolas" w:eastAsia="Consolas" w:hAnsi="Consolas"/>
+                <w:color w:val="7A2E0E"/>
+                <w:sz w:val="19"/>
+                <w:szCs w:val="19"/>
+              </w:rPr>
+              <w:t xml:space="preserve">http://localhost:8001/health</w:t>
+            </w:r>
+          </w:p>
+        </w:tc>
+      </w:tr>
+      <w:tr>
+        <w:trPr>
+          <w:cantSplit/>
+        </w:trPr>
+        <w:tc>
+          <w:tcPr>
+            <w:tcW w:type="dxa" w:w="4337"/>
+            <w:tcBorders>
+              <w:top w:val="single" w:color="BFBFBF" w:sz="4"/>
+              <w:left w:val="single" w:color="BFBFBF" w:sz="4"/>
+              <w:bottom w:val="single" w:color="BFBFBF" w:sz="4"/>
+              <w:right w:val="single" w:color="BFBFBF" w:sz="4"/>
+            </w:tcBorders>
+            <w:tcMar>
+              <w:top w:type="dxa" w:w="50"/>
+              <w:left w:type="dxa" w:w="90"/>
+              <w:bottom w:type="dxa" w:w="50"/>
+              <w:right w:type="dxa" w:w="90"/>
+            </w:tcMar>
+          </w:tcPr>
+          <w:p>
+            <w:pPr>
+              <w:spacing w:after="0"/>
+            </w:pPr>
+            <w:r>
+              <w:rPr>
+                <w:sz w:val="19"/>
+                <w:szCs w:val="19"/>
+              </w:rPr>
+              <w:t xml:space="preserve">JWKS (local)</w:t>
             </w:r>
           </w:p>
         </w:tc>
@@ -22638,98 +23059,6 @@
                 <w:sz w:val="19"/>
                 <w:szCs w:val="19"/>
               </w:rPr>
-              <w:t xml:space="preserve">Shared environment URL</w:t>
-            </w:r>
-          </w:p>
-        </w:tc>
-        <w:tc>
-          <w:tcPr>
-            <w:tcW w:type="dxa" w:w="5012"/>
-            <w:tcBorders>
-              <w:top w:val="single" w:color="BFBFBF" w:sz="4"/>
-              <w:left w:val="single" w:color="BFBFBF" w:sz="4"/>
-              <w:bottom w:val="single" w:color="BFBFBF" w:sz="4"/>
-              <w:right w:val="single" w:color="BFBFBF" w:sz="4"/>
-            </w:tcBorders>
-            <w:tcMar>
-              <w:top w:type="dxa" w:w="50"/>
-              <w:left w:type="dxa" w:w="90"/>
-              <w:bottom w:type="dxa" w:w="50"/>
-              <w:right w:type="dxa" w:w="90"/>
-            </w:tcMar>
-          </w:tcPr>
-          <w:p>
-            <w:pPr>
-              <w:spacing w:after="0"/>
-            </w:pPr>
-            <w:r>
-              <w:rPr>
-                <w:sz w:val="19"/>
-                <w:szCs w:val="19"/>
-              </w:rPr>
-              <w:t xml:space="preserve">Service runs locally or in Docker Compose on port 8001. A shared deployment URL will be announced.</w:t>
-            </w:r>
-          </w:p>
-        </w:tc>
-        <w:tc>
-          <w:tcPr>
-            <w:tcW w:type="dxa" w:w="2120"/>
-            <w:tcBorders>
-              <w:top w:val="single" w:color="BFBFBF" w:sz="4"/>
-              <w:left w:val="single" w:color="BFBFBF" w:sz="4"/>
-              <w:bottom w:val="single" w:color="BFBFBF" w:sz="4"/>
-              <w:right w:val="single" w:color="BFBFBF" w:sz="4"/>
-            </w:tcBorders>
-            <w:tcMar>
-              <w:top w:type="dxa" w:w="50"/>
-              <w:left w:type="dxa" w:w="90"/>
-              <w:bottom w:type="dxa" w:w="50"/>
-              <w:right w:type="dxa" w:w="90"/>
-            </w:tcMar>
-          </w:tcPr>
-          <w:p>
-            <w:pPr>
-              <w:spacing w:after="0"/>
-            </w:pPr>
-            <w:r>
-              <w:rPr>
-                <w:sz w:val="19"/>
-                <w:szCs w:val="19"/>
-              </w:rPr>
-              <w:t xml:space="preserve">Group 5 with platform/Gateway team</w:t>
-            </w:r>
-          </w:p>
-        </w:tc>
-      </w:tr>
-      <w:tr>
-        <w:trPr>
-          <w:cantSplit/>
-        </w:trPr>
-        <w:tc>
-          <w:tcPr>
-            <w:tcW w:type="dxa" w:w="2506"/>
-            <w:tcBorders>
-              <w:top w:val="single" w:color="BFBFBF" w:sz="4"/>
-              <w:left w:val="single" w:color="BFBFBF" w:sz="4"/>
-              <w:bottom w:val="single" w:color="BFBFBF" w:sz="4"/>
-              <w:right w:val="single" w:color="BFBFBF" w:sz="4"/>
-            </w:tcBorders>
-            <w:tcMar>
-              <w:top w:type="dxa" w:w="50"/>
-              <w:left w:type="dxa" w:w="90"/>
-              <w:bottom w:type="dxa" w:w="50"/>
-              <w:right w:type="dxa" w:w="90"/>
-            </w:tcMar>
-          </w:tcPr>
-          <w:p>
-            <w:pPr>
-              <w:spacing w:after="0"/>
-            </w:pPr>
-            <w:r>
-              <w:rPr>
-                <w:sz w:val="19"/>
-                <w:szCs w:val="19"/>
-              </w:rPr>
               <w:t xml:space="preserve">Service-to-service tokens</w:t>
             </w:r>
           </w:p>
@@ -23029,10 +23358,10 @@
           <w:b/>
           <w:bCs/>
         </w:rPr>
-        <w:t xml:space="preserve">Development signing keys.</w:t>
-      </w:r>
-      <w:r>
-        <w:t xml:space="preserve"> Without configured key files, the service generates a new key pair at startup, so tokens issued before a restart become invalid. Refetch the JWKS on an unknown </w:t>
+        <w:t xml:space="preserve">Development signing keys (local runs only).</w:t>
+      </w:r>
+      <w:r>
+        <w:t xml:space="preserve"> The hosted service uses fixed keys. Locally, without configured key files, the service generates a new key pair at startup, so tokens issued before a restart become invalid. Refetch the JWKS on an unknown </w:t>
       </w:r>
       <w:r>
         <w:rPr>
@@ -23124,22 +23453,10 @@
           <w:b/>
           <w:bCs/>
         </w:rPr>
-        <w:t xml:space="preserve">Default database is SQLite</w:t>
-      </w:r>
-      <w:r>
-        <w:t xml:space="preserve">, which is fine for development and demos but not for concurrent production load; any SQLAlchemy database can be used through </w:t>
-      </w:r>
-      <w:r>
-        <w:rPr>
-          <w:rFonts w:ascii="Consolas" w:cs="Consolas" w:eastAsia="Consolas" w:hAnsi="Consolas"/>
-          <w:color w:val="7A2E0E"/>
-          <w:sz w:val="19"/>
-          <w:szCs w:val="19"/>
-        </w:rPr>
-        <w:t xml:space="preserve">DATABASE_URL</w:t>
-      </w:r>
-      <w:r>
-        <w:t xml:space="preserve">.</w:t>
+        <w:t xml:space="preserve">Hosted on Render's free plan.</w:t>
+      </w:r>
+      <w:r>
+        <w:t xml:space="preserve"> The service sleeps after 15 minutes idle and takes about a minute to wake. Its free PostgreSQL database expires after 30 days; Group 5 will move it before then, and demo users are re-created automatically.</w:t>
       </w:r>
     </w:p>
     <w:p>
@@ -23907,6 +24224,114 @@
                 <w:szCs w:val="19"/>
               </w:rPr>
               <w:t xml:space="preserve"> for running behind the gateway. Examples now use the Directory Service's real ID format. No breaking changes.</w:t>
+            </w:r>
+          </w:p>
+        </w:tc>
+      </w:tr>
+      <w:tr>
+        <w:trPr>
+          <w:cantSplit/>
+        </w:trPr>
+        <w:tc>
+          <w:tcPr>
+            <w:tcW w:type="dxa" w:w="1157"/>
+            <w:tcBorders>
+              <w:top w:val="single" w:color="BFBFBF" w:sz="4"/>
+              <w:left w:val="single" w:color="BFBFBF" w:sz="4"/>
+              <w:bottom w:val="single" w:color="BFBFBF" w:sz="4"/>
+              <w:right w:val="single" w:color="BFBFBF" w:sz="4"/>
+            </w:tcBorders>
+            <w:tcMar>
+              <w:top w:type="dxa" w:w="50"/>
+              <w:left w:type="dxa" w:w="90"/>
+              <w:bottom w:type="dxa" w:w="50"/>
+              <w:right w:type="dxa" w:w="90"/>
+            </w:tcMar>
+          </w:tcPr>
+          <w:p>
+            <w:pPr>
+              <w:spacing w:after="0"/>
+            </w:pPr>
+            <w:r>
+              <w:rPr>
+                <w:sz w:val="19"/>
+                <w:szCs w:val="19"/>
+              </w:rPr>
+              <w:t xml:space="preserve">v1</w:t>
+            </w:r>
+          </w:p>
+        </w:tc>
+        <w:tc>
+          <w:tcPr>
+            <w:tcW w:type="dxa" w:w="1928"/>
+            <w:tcBorders>
+              <w:top w:val="single" w:color="BFBFBF" w:sz="4"/>
+              <w:left w:val="single" w:color="BFBFBF" w:sz="4"/>
+              <w:bottom w:val="single" w:color="BFBFBF" w:sz="4"/>
+              <w:right w:val="single" w:color="BFBFBF" w:sz="4"/>
+            </w:tcBorders>
+            <w:tcMar>
+              <w:top w:type="dxa" w:w="50"/>
+              <w:left w:type="dxa" w:w="90"/>
+              <w:bottom w:type="dxa" w:w="50"/>
+              <w:right w:type="dxa" w:w="90"/>
+            </w:tcMar>
+          </w:tcPr>
+          <w:p>
+            <w:pPr>
+              <w:spacing w:after="0"/>
+            </w:pPr>
+            <w:r>
+              <w:rPr>
+                <w:sz w:val="19"/>
+                <w:szCs w:val="19"/>
+              </w:rPr>
+              <w:t xml:space="preserve">30 September 2026</w:t>
+            </w:r>
+          </w:p>
+        </w:tc>
+        <w:tc>
+          <w:tcPr>
+            <w:tcW w:type="dxa" w:w="6553"/>
+            <w:tcBorders>
+              <w:top w:val="single" w:color="BFBFBF" w:sz="4"/>
+              <w:left w:val="single" w:color="BFBFBF" w:sz="4"/>
+              <w:bottom w:val="single" w:color="BFBFBF" w:sz="4"/>
+              <w:right w:val="single" w:color="BFBFBF" w:sz="4"/>
+            </w:tcBorders>
+            <w:tcMar>
+              <w:top w:type="dxa" w:w="50"/>
+              <w:left w:type="dxa" w:w="90"/>
+              <w:bottom w:type="dxa" w:w="50"/>
+              <w:right w:type="dxa" w:w="90"/>
+            </w:tcMar>
+          </w:tcPr>
+          <w:p>
+            <w:pPr>
+              <w:spacing w:after="0"/>
+            </w:pPr>
+            <w:r>
+              <w:rPr>
+                <w:sz w:val="19"/>
+                <w:szCs w:val="19"/>
+              </w:rPr>
+              <w:t xml:space="preserve">Hosted on Render at </w:t>
+            </w:r>
+            <w:r>
+              <w:rPr>
+                <w:rFonts w:ascii="Consolas" w:cs="Consolas" w:eastAsia="Consolas" w:hAnsi="Consolas"/>
+                <w:color w:val="7A2E0E"/>
+                <w:sz w:val="19"/>
+                <w:szCs w:val="19"/>
+              </w:rPr>
+              <w:t xml:space="preserve">https://university-identity-service.onrender.com</w:t>
+            </w:r>
+            <w:r>
+              <w:rPr>
+                <w:sz w:val="19"/>
+                <w:szCs w:val="19"/>
+              </w:rPr>
+              <w:t xml:space="preserve"> (PostgreSQL, persistent signing keys). No API changes.</w:t>
             </w:r>
           </w:p>
         </w:tc>

</xml_diff>

<commit_message>
feat(identity): add a second active demo student
Group 8 asked for demo students in two different departments to test
department-restricted events. The demo data had one active student
(STU001) and one inactive student (STU002).

STU003 (usr-student-003) is an active STUDENT. Seeding skips existing
users, so the next start of an existing deployment adds only STU003,
with the same demo password. README and handover document list it.
</commit_message>
<xml_diff>
--- a/docs/Identity_Service_Integration_Handover.docx
+++ b/docs/Identity_Service_Integration_Handover.docx
@@ -19619,6 +19619,187 @@
                 <w:sz w:val="19"/>
                 <w:szCs w:val="19"/>
               </w:rPr>
+              <w:t xml:space="preserve">usr-student-003</w:t>
+            </w:r>
+          </w:p>
+        </w:tc>
+        <w:tc>
+          <w:tcPr>
+            <w:tcW w:type="dxa" w:w="1157"/>
+            <w:tcBorders>
+              <w:top w:val="single" w:color="BFBFBF" w:sz="4"/>
+              <w:left w:val="single" w:color="BFBFBF" w:sz="4"/>
+              <w:bottom w:val="single" w:color="BFBFBF" w:sz="4"/>
+              <w:right w:val="single" w:color="BFBFBF" w:sz="4"/>
+            </w:tcBorders>
+            <w:tcMar>
+              <w:top w:type="dxa" w:w="50"/>
+              <w:left w:type="dxa" w:w="90"/>
+              <w:bottom w:type="dxa" w:w="50"/>
+              <w:right w:type="dxa" w:w="90"/>
+            </w:tcMar>
+          </w:tcPr>
+          <w:p>
+            <w:pPr>
+              <w:spacing w:after="0"/>
+            </w:pPr>
+            <w:r>
+              <w:rPr>
+                <w:sz w:val="19"/>
+                <w:szCs w:val="19"/>
+              </w:rPr>
+              <w:t xml:space="preserve">STU003</w:t>
+            </w:r>
+          </w:p>
+        </w:tc>
+        <w:tc>
+          <w:tcPr>
+            <w:tcW w:type="dxa" w:w="2313"/>
+            <w:tcBorders>
+              <w:top w:val="single" w:color="BFBFBF" w:sz="4"/>
+              <w:left w:val="single" w:color="BFBFBF" w:sz="4"/>
+              <w:bottom w:val="single" w:color="BFBFBF" w:sz="4"/>
+              <w:right w:val="single" w:color="BFBFBF" w:sz="4"/>
+            </w:tcBorders>
+            <w:tcMar>
+              <w:top w:type="dxa" w:w="50"/>
+              <w:left w:type="dxa" w:w="90"/>
+              <w:bottom w:type="dxa" w:w="50"/>
+              <w:right w:type="dxa" w:w="90"/>
+            </w:tcMar>
+          </w:tcPr>
+          <w:p>
+            <w:pPr>
+              <w:spacing w:after="0"/>
+            </w:pPr>
+            <w:r>
+              <w:rPr>
+                <w:sz w:val="19"/>
+                <w:szCs w:val="19"/>
+              </w:rPr>
+              <w:t xml:space="preserve">Demo Student (Second Department)</w:t>
+            </w:r>
+          </w:p>
+        </w:tc>
+        <w:tc>
+          <w:tcPr>
+            <w:tcW w:type="dxa" w:w="964"/>
+            <w:tcBorders>
+              <w:top w:val="single" w:color="BFBFBF" w:sz="4"/>
+              <w:left w:val="single" w:color="BFBFBF" w:sz="4"/>
+              <w:bottom w:val="single" w:color="BFBFBF" w:sz="4"/>
+              <w:right w:val="single" w:color="BFBFBF" w:sz="4"/>
+            </w:tcBorders>
+            <w:tcMar>
+              <w:top w:type="dxa" w:w="50"/>
+              <w:left w:type="dxa" w:w="90"/>
+              <w:bottom w:type="dxa" w:w="50"/>
+              <w:right w:type="dxa" w:w="90"/>
+            </w:tcMar>
+          </w:tcPr>
+          <w:p>
+            <w:pPr>
+              <w:spacing w:after="0"/>
+            </w:pPr>
+            <w:r>
+              <w:rPr>
+                <w:sz w:val="19"/>
+                <w:szCs w:val="19"/>
+              </w:rPr>
+              <w:t xml:space="preserve">STUDENT</w:t>
+            </w:r>
+          </w:p>
+        </w:tc>
+        <w:tc>
+          <w:tcPr>
+            <w:tcW w:type="dxa" w:w="2120"/>
+            <w:tcBorders>
+              <w:top w:val="single" w:color="BFBFBF" w:sz="4"/>
+              <w:left w:val="single" w:color="BFBFBF" w:sz="4"/>
+              <w:bottom w:val="single" w:color="BFBFBF" w:sz="4"/>
+              <w:right w:val="single" w:color="BFBFBF" w:sz="4"/>
+            </w:tcBorders>
+            <w:tcMar>
+              <w:top w:type="dxa" w:w="50"/>
+              <w:left w:type="dxa" w:w="90"/>
+              <w:bottom w:type="dxa" w:w="50"/>
+              <w:right w:type="dxa" w:w="90"/>
+            </w:tcMar>
+          </w:tcPr>
+          <w:p>
+            <w:pPr>
+              <w:spacing w:after="0"/>
+            </w:pPr>
+            <w:r>
+              <w:rPr>
+                <w:sz w:val="19"/>
+                <w:szCs w:val="19"/>
+              </w:rPr>
+              <w:t xml:space="preserve">STUDENT</w:t>
+            </w:r>
+          </w:p>
+        </w:tc>
+        <w:tc>
+          <w:tcPr>
+            <w:tcW w:type="dxa" w:w="964"/>
+            <w:tcBorders>
+              <w:top w:val="single" w:color="BFBFBF" w:sz="4"/>
+              <w:left w:val="single" w:color="BFBFBF" w:sz="4"/>
+              <w:bottom w:val="single" w:color="BFBFBF" w:sz="4"/>
+              <w:right w:val="single" w:color="BFBFBF" w:sz="4"/>
+            </w:tcBorders>
+            <w:tcMar>
+              <w:top w:type="dxa" w:w="50"/>
+              <w:left w:type="dxa" w:w="90"/>
+              <w:bottom w:type="dxa" w:w="50"/>
+              <w:right w:type="dxa" w:w="90"/>
+            </w:tcMar>
+          </w:tcPr>
+          <w:p>
+            <w:pPr>
+              <w:spacing w:after="0"/>
+            </w:pPr>
+            <w:r>
+              <w:rPr>
+                <w:sz w:val="19"/>
+                <w:szCs w:val="19"/>
+              </w:rPr>
+              <w:t xml:space="preserve">Active</w:t>
+            </w:r>
+          </w:p>
+        </w:tc>
+      </w:tr>
+      <w:tr>
+        <w:trPr>
+          <w:cantSplit/>
+        </w:trPr>
+        <w:tc>
+          <w:tcPr>
+            <w:tcW w:type="dxa" w:w="2120"/>
+            <w:tcBorders>
+              <w:top w:val="single" w:color="BFBFBF" w:sz="4"/>
+              <w:left w:val="single" w:color="BFBFBF" w:sz="4"/>
+              <w:bottom w:val="single" w:color="BFBFBF" w:sz="4"/>
+              <w:right w:val="single" w:color="BFBFBF" w:sz="4"/>
+            </w:tcBorders>
+            <w:tcMar>
+              <w:top w:type="dxa" w:w="50"/>
+              <w:left w:type="dxa" w:w="90"/>
+              <w:bottom w:type="dxa" w:w="50"/>
+              <w:right w:type="dxa" w:w="90"/>
+            </w:tcMar>
+          </w:tcPr>
+          <w:p>
+            <w:pPr>
+              <w:spacing w:after="0"/>
+            </w:pPr>
+            <w:r>
+              <w:rPr>
+                <w:rFonts w:ascii="Consolas" w:cs="Consolas" w:eastAsia="Consolas" w:hAnsi="Consolas"/>
+                <w:color w:val="7A2E0E"/>
+                <w:sz w:val="19"/>
+                <w:szCs w:val="19"/>
+              </w:rPr>
               <w:t xml:space="preserve">usr-academic-001</w:t>
             </w:r>
           </w:p>
@@ -24332,6 +24513,114 @@
                 <w:szCs w:val="19"/>
               </w:rPr>
               <w:t xml:space="preserve"> (PostgreSQL, persistent signing keys). No API changes.</w:t>
+            </w:r>
+          </w:p>
+        </w:tc>
+      </w:tr>
+      <w:tr>
+        <w:trPr>
+          <w:cantSplit/>
+        </w:trPr>
+        <w:tc>
+          <w:tcPr>
+            <w:tcW w:type="dxa" w:w="1157"/>
+            <w:tcBorders>
+              <w:top w:val="single" w:color="BFBFBF" w:sz="4"/>
+              <w:left w:val="single" w:color="BFBFBF" w:sz="4"/>
+              <w:bottom w:val="single" w:color="BFBFBF" w:sz="4"/>
+              <w:right w:val="single" w:color="BFBFBF" w:sz="4"/>
+            </w:tcBorders>
+            <w:tcMar>
+              <w:top w:type="dxa" w:w="50"/>
+              <w:left w:type="dxa" w:w="90"/>
+              <w:bottom w:type="dxa" w:w="50"/>
+              <w:right w:type="dxa" w:w="90"/>
+            </w:tcMar>
+          </w:tcPr>
+          <w:p>
+            <w:pPr>
+              <w:spacing w:after="0"/>
+            </w:pPr>
+            <w:r>
+              <w:rPr>
+                <w:sz w:val="19"/>
+                <w:szCs w:val="19"/>
+              </w:rPr>
+              <w:t xml:space="preserve">v1</w:t>
+            </w:r>
+          </w:p>
+        </w:tc>
+        <w:tc>
+          <w:tcPr>
+            <w:tcW w:type="dxa" w:w="1928"/>
+            <w:tcBorders>
+              <w:top w:val="single" w:color="BFBFBF" w:sz="4"/>
+              <w:left w:val="single" w:color="BFBFBF" w:sz="4"/>
+              <w:bottom w:val="single" w:color="BFBFBF" w:sz="4"/>
+              <w:right w:val="single" w:color="BFBFBF" w:sz="4"/>
+            </w:tcBorders>
+            <w:tcMar>
+              <w:top w:type="dxa" w:w="50"/>
+              <w:left w:type="dxa" w:w="90"/>
+              <w:bottom w:type="dxa" w:w="50"/>
+              <w:right w:type="dxa" w:w="90"/>
+            </w:tcMar>
+          </w:tcPr>
+          <w:p>
+            <w:pPr>
+              <w:spacing w:after="0"/>
+            </w:pPr>
+            <w:r>
+              <w:rPr>
+                <w:sz w:val="19"/>
+                <w:szCs w:val="19"/>
+              </w:rPr>
+              <w:t xml:space="preserve">30 September 2026</w:t>
+            </w:r>
+          </w:p>
+        </w:tc>
+        <w:tc>
+          <w:tcPr>
+            <w:tcW w:type="dxa" w:w="6553"/>
+            <w:tcBorders>
+              <w:top w:val="single" w:color="BFBFBF" w:sz="4"/>
+              <w:left w:val="single" w:color="BFBFBF" w:sz="4"/>
+              <w:bottom w:val="single" w:color="BFBFBF" w:sz="4"/>
+              <w:right w:val="single" w:color="BFBFBF" w:sz="4"/>
+            </w:tcBorders>
+            <w:tcMar>
+              <w:top w:type="dxa" w:w="50"/>
+              <w:left w:type="dxa" w:w="90"/>
+              <w:bottom w:type="dxa" w:w="50"/>
+              <w:right w:type="dxa" w:w="90"/>
+            </w:tcMar>
+          </w:tcPr>
+          <w:p>
+            <w:pPr>
+              <w:spacing w:after="0"/>
+            </w:pPr>
+            <w:r>
+              <w:rPr>
+                <w:sz w:val="19"/>
+                <w:szCs w:val="19"/>
+              </w:rPr>
+              <w:t xml:space="preserve">Added demo user </w:t>
+            </w:r>
+            <w:r>
+              <w:rPr>
+                <w:rFonts w:ascii="Consolas" w:cs="Consolas" w:eastAsia="Consolas" w:hAnsi="Consolas"/>
+                <w:color w:val="7A2E0E"/>
+                <w:sz w:val="19"/>
+                <w:szCs w:val="19"/>
+              </w:rPr>
+              <w:t xml:space="preserve">STU003</w:t>
+            </w:r>
+            <w:r>
+              <w:rPr>
+                <w:sz w:val="19"/>
+                <w:szCs w:val="19"/>
+              </w:rPr>
+              <w:t xml:space="preserve">, a second active student for department-restricted checks. No API changes.</w:t>
             </w:r>
           </w:p>
         </w:tc>

</xml_diff>